<commit_message>
fixed the library img (i hope)
</commit_message>
<xml_diff>
--- a/CIT 312 Midterm Project.docx
+++ b/CIT 312 Midterm Project.docx
@@ -53,7 +53,15 @@
     </w:p>
     <w:p>
       <w:r>
-        <w:t>3. Use Live Server (VSCode) for LESS compilation</w:t>
+        <w:t>3. Use Live Server (</w:t>
+      </w:r>
+      <w:proofErr w:type="spellStart"/>
+      <w:r>
+        <w:t>VSCode</w:t>
+      </w:r>
+      <w:proofErr w:type="spellEnd"/>
+      <w:r>
+        <w:t>) for LESS compilation</w:t>
       </w:r>
     </w:p>
     <w:p/>
@@ -992,7 +1000,31 @@
                 <w:szCs w:val="18"/>
                 <w14:ligatures w14:val="none"/>
               </w:rPr>
-              <w:t xml:space="preserve">, the flanking imgs are hidden before they overlap. </w:t>
+              <w:t xml:space="preserve">, the flanking </w:t>
+            </w:r>
+            <w:proofErr w:type="spellStart"/>
+            <w:r>
+              <w:rPr>
+                <w:rFonts w:ascii="Aptos" w:hAnsi="Aptos" w:cs="Times New Roman"/>
+                <w:color w:val="494C4E"/>
+                <w:kern w:val="0"/>
+                <w:sz w:val="18"/>
+                <w:szCs w:val="18"/>
+                <w14:ligatures w14:val="none"/>
+              </w:rPr>
+              <w:t>imgs</w:t>
+            </w:r>
+            <w:proofErr w:type="spellEnd"/>
+            <w:r>
+              <w:rPr>
+                <w:rFonts w:ascii="Aptos" w:hAnsi="Aptos" w:cs="Times New Roman"/>
+                <w:color w:val="494C4E"/>
+                <w:kern w:val="0"/>
+                <w:sz w:val="18"/>
+                <w:szCs w:val="18"/>
+                <w14:ligatures w14:val="none"/>
+              </w:rPr>
+              <w:t xml:space="preserve"> are hidden before they overlap. </w:t>
             </w:r>
           </w:p>
           <w:p>
@@ -1309,11 +1341,33 @@
         <w:lastRenderedPageBreak/>
         <w:t>GITHUB REPO:</w:t>
       </w:r>
+      <w:r>
+        <w:t xml:space="preserve"> </w:t>
+      </w:r>
+      <w:hyperlink r:id="rId4" w:history="1">
+        <w:r>
+          <w:rPr>
+            <w:rStyle w:val="Hyperlink"/>
+          </w:rPr>
+          <w:t>https://github.com/PinkArmy10/312-Midterm-Practical---Selected-Topic-Focused-Web-App</w:t>
+        </w:r>
+      </w:hyperlink>
     </w:p>
     <w:p>
       <w:r>
         <w:t>LIVE SITE:</w:t>
       </w:r>
+      <w:r>
+        <w:t xml:space="preserve"> </w:t>
+      </w:r>
+      <w:hyperlink r:id="rId5" w:history="1">
+        <w:r>
+          <w:rPr>
+            <w:rStyle w:val="Hyperlink"/>
+          </w:rPr>
+          <w:t>https://pinkarmy10.github.io/312-Midterm-Practical---Selected-Topic-Focused-Web-App/</w:t>
+        </w:r>
+      </w:hyperlink>
     </w:p>
     <w:p/>
     <w:p>
@@ -1326,6 +1380,9 @@
     </w:p>
     <w:p>
       <w:r>
+        <w:rPr>
+          <w:noProof/>
+        </w:rPr>
         <w:drawing>
           <wp:inline distT="0" distB="0" distL="0" distR="0" wp14:anchorId="239EB31B" wp14:editId="4EB86023">
             <wp:extent cx="5494294" cy="4468633"/>
@@ -1342,7 +1399,7 @@
                     <pic:cNvPicPr/>
                   </pic:nvPicPr>
                   <pic:blipFill rotWithShape="1">
-                    <a:blip r:embed="rId4"/>
+                    <a:blip r:embed="rId6"/>
                     <a:srcRect r="33913"/>
                     <a:stretch>
                       <a:fillRect/>
@@ -2299,6 +2356,29 @@
       <w:spacing w:val="5"/>
     </w:rPr>
   </w:style>
+  <w:style w:type="character" w:styleId="Hyperlink">
+    <w:name w:val="Hyperlink"/>
+    <w:basedOn w:val="DefaultParagraphFont"/>
+    <w:uiPriority w:val="99"/>
+    <w:unhideWhenUsed/>
+    <w:rsid w:val="002910D1"/>
+    <w:rPr>
+      <w:color w:val="0563C1" w:themeColor="hyperlink"/>
+      <w:u w:val="single"/>
+    </w:rPr>
+  </w:style>
+  <w:style w:type="character" w:styleId="UnresolvedMention">
+    <w:name w:val="Unresolved Mention"/>
+    <w:basedOn w:val="DefaultParagraphFont"/>
+    <w:uiPriority w:val="99"/>
+    <w:semiHidden/>
+    <w:unhideWhenUsed/>
+    <w:rsid w:val="002910D1"/>
+    <w:rPr>
+      <w:color w:val="605E5C"/>
+      <w:shd w:val="clear" w:color="auto" w:fill="E1DFDD"/>
+    </w:rPr>
+  </w:style>
 </w:styles>
 </file>
 

</xml_diff>

<commit_message>
Added more information into docx file
</commit_message>
<xml_diff>
--- a/CIT 312 Midterm Project.docx
+++ b/CIT 312 Midterm Project.docx
@@ -12,6 +12,9 @@
       </w:r>
     </w:p>
     <w:p>
+      <w:pPr>
+        <w:pStyle w:val="Heading2"/>
+      </w:pPr>
       <w:r>
         <w:t>ABSTRACT</w:t>
       </w:r>
@@ -23,48 +26,142 @@
     </w:p>
     <w:p>
       <w:r>
-        <w:t>I chose this as I love readding and have a lot of books. I thought I should share some of my favori</w:t>
+        <w:t xml:space="preserve">I chose this as I love </w:t>
+      </w:r>
+      <w:r>
+        <w:t>reading</w:t>
+      </w:r>
+      <w:r>
+        <w:t xml:space="preserve"> and have a lot of books. I thought I should share some of my favori</w:t>
       </w:r>
       <w:r>
         <w:t xml:space="preserve">tes and get suggestions from people. </w:t>
+      </w:r>
+      <w:r>
+        <w:t>I think it would combine well with a previous project I did where I have arrays filled with the actual books I own.</w:t>
       </w:r>
     </w:p>
     <w:p/>
     <w:p>
+      <w:pPr>
+        <w:pStyle w:val="Heading2"/>
+      </w:pPr>
       <w:r>
         <w:t>RUN INSTRUCTIONS</w:t>
       </w:r>
     </w:p>
     <w:p>
-      <w:r>
-        <w:t xml:space="preserve">1. Clone </w:t>
-      </w:r>
-      <w:r>
-        <w:t xml:space="preserve">the </w:t>
-      </w:r>
-      <w:r>
-        <w:t>GitHub repo</w:t>
+      <w:pPr>
+        <w:pStyle w:val="Heading3"/>
+      </w:pPr>
+      <w:r>
+        <w:t>LIVE VERSION</w:t>
       </w:r>
     </w:p>
     <w:p>
-      <w:r>
-        <w:t>2. Open index.html OR visit GitHub Pages link</w:t>
-      </w:r>
+      <w:pPr>
+        <w:rPr>
+          <w:rFonts w:cstheme="minorHAnsi"/>
+        </w:rPr>
+      </w:pPr>
+      <w:r>
+        <w:rPr>
+          <w:rFonts w:eastAsia="MS Gothic" w:cstheme="minorHAnsi"/>
+        </w:rPr>
+        <w:t xml:space="preserve">- </w:t>
+      </w:r>
+      <w:r>
+        <w:rPr>
+          <w:rFonts w:cstheme="minorHAnsi"/>
+        </w:rPr>
+        <w:t xml:space="preserve">Visit: </w:t>
+      </w:r>
+      <w:hyperlink r:id="rId4" w:history="1">
+        <w:r>
+          <w:rPr>
+            <w:rStyle w:val="Hyperlink"/>
+            <w:rFonts w:cstheme="minorHAnsi"/>
+          </w:rPr>
+          <w:t>https://timonmatis.github.io/tm-library-midterm/</w:t>
+        </w:r>
+      </w:hyperlink>
     </w:p>
     <w:p>
-      <w:r>
-        <w:t>3. Use Live Server (</w:t>
+      <w:pPr>
+        <w:rPr>
+          <w:rFonts w:cstheme="minorHAnsi"/>
+        </w:rPr>
+      </w:pPr>
+    </w:p>
+    <w:p>
+      <w:pPr>
+        <w:pStyle w:val="Heading3"/>
+      </w:pPr>
+      <w:r>
+        <w:t>LOCAL DEVELOPMENT</w:t>
+      </w:r>
+    </w:p>
+    <w:p>
+      <w:pPr>
+        <w:rPr>
+          <w:rFonts w:cstheme="minorHAnsi"/>
+        </w:rPr>
+      </w:pPr>
+      <w:r>
+        <w:rPr>
+          <w:rFonts w:cstheme="minorHAnsi"/>
+        </w:rPr>
+        <w:t>1. Clone repo: git clone https://github.com/timonmatis/tm-library-midterm.git</w:t>
+      </w:r>
+    </w:p>
+    <w:p>
+      <w:pPr>
+        <w:rPr>
+          <w:rFonts w:cstheme="minorHAnsi"/>
+        </w:rPr>
+      </w:pPr>
+      <w:r>
+        <w:rPr>
+          <w:rFonts w:cstheme="minorHAnsi"/>
+        </w:rPr>
+        <w:t xml:space="preserve">2. Open </w:t>
+      </w:r>
+      <w:r>
+        <w:rPr>
+          <w:rFonts w:cstheme="minorHAnsi"/>
+        </w:rPr>
+        <w:t xml:space="preserve">via </w:t>
+      </w:r>
+      <w:r>
+        <w:rPr>
+          <w:rFonts w:cstheme="minorHAnsi"/>
+        </w:rPr>
+        <w:t>Live Server (</w:t>
       </w:r>
       <w:proofErr w:type="spellStart"/>
       <w:r>
+        <w:rPr>
+          <w:rFonts w:cstheme="minorHAnsi"/>
+        </w:rPr>
         <w:t>VSCode</w:t>
       </w:r>
       <w:proofErr w:type="spellEnd"/>
       <w:r>
+        <w:rPr>
+          <w:rFonts w:cstheme="minorHAnsi"/>
+        </w:rPr>
         <w:t>) for LESS compilation</w:t>
       </w:r>
     </w:p>
     <w:p/>
+    <w:p>
+      <w:pPr>
+        <w:pStyle w:val="Heading2"/>
+      </w:pPr>
+      <w:r>
+        <w:t>Table</w:t>
+      </w:r>
+    </w:p>
     <w:tbl>
       <w:tblPr>
         <w:tblW w:w="0" w:type="auto"/>
@@ -765,7 +862,31 @@
                 <w:szCs w:val="18"/>
                 <w14:ligatures w14:val="none"/>
               </w:rPr>
-              <w:t>- a form to fill out about your recommendation for me. With temp text to aid user in filling it out.</w:t>
+              <w:t xml:space="preserve">- a form to fill out about your recommendation for me. With temp text to aid user in </w:t>
+            </w:r>
+            <w:proofErr w:type="gramStart"/>
+            <w:r>
+              <w:rPr>
+                <w:rFonts w:ascii="Aptos" w:hAnsi="Aptos" w:cs="Times New Roman"/>
+                <w:color w:val="494C4E"/>
+                <w:kern w:val="0"/>
+                <w:sz w:val="18"/>
+                <w:szCs w:val="18"/>
+                <w14:ligatures w14:val="none"/>
+              </w:rPr>
+              <w:t>filling</w:t>
+            </w:r>
+            <w:proofErr w:type="gramEnd"/>
+            <w:r>
+              <w:rPr>
+                <w:rFonts w:ascii="Aptos" w:hAnsi="Aptos" w:cs="Times New Roman"/>
+                <w:color w:val="494C4E"/>
+                <w:kern w:val="0"/>
+                <w:sz w:val="18"/>
+                <w:szCs w:val="18"/>
+                <w14:ligatures w14:val="none"/>
+              </w:rPr>
+              <w:t xml:space="preserve"> it out.</w:t>
             </w:r>
           </w:p>
           <w:p>
@@ -789,7 +910,31 @@
                 <w:szCs w:val="18"/>
                 <w14:ligatures w14:val="none"/>
               </w:rPr>
-              <w:t>- forum sends alert with filled in info to simulate sending to a database.</w:t>
+              <w:t xml:space="preserve">- forum sends </w:t>
+            </w:r>
+            <w:proofErr w:type="gramStart"/>
+            <w:r>
+              <w:rPr>
+                <w:rFonts w:ascii="Aptos" w:hAnsi="Aptos" w:cs="Times New Roman"/>
+                <w:color w:val="494C4E"/>
+                <w:kern w:val="0"/>
+                <w:sz w:val="18"/>
+                <w:szCs w:val="18"/>
+                <w14:ligatures w14:val="none"/>
+              </w:rPr>
+              <w:t>alert</w:t>
+            </w:r>
+            <w:proofErr w:type="gramEnd"/>
+            <w:r>
+              <w:rPr>
+                <w:rFonts w:ascii="Aptos" w:hAnsi="Aptos" w:cs="Times New Roman"/>
+                <w:color w:val="494C4E"/>
+                <w:kern w:val="0"/>
+                <w:sz w:val="18"/>
+                <w:szCs w:val="18"/>
+                <w14:ligatures w14:val="none"/>
+              </w:rPr>
+              <w:t xml:space="preserve"> with filled in info to simulate sending to a database.</w:t>
             </w:r>
           </w:p>
           <w:p>
@@ -925,6 +1070,7 @@
                 <w:szCs w:val="18"/>
                 <w14:ligatures w14:val="none"/>
               </w:rPr>
+              <w:lastRenderedPageBreak/>
               <w:t>Responsiveness</w:t>
             </w:r>
           </w:p>
@@ -1329,22 +1475,78 @@
                 <w:szCs w:val="18"/>
                 <w14:ligatures w14:val="none"/>
               </w:rPr>
-              <w:t>Cozy Library colors: #731D2C, #59573C, #D99748, #401801, #8C471F</w:t>
+              <w:t xml:space="preserve">Cozy Library </w:t>
+            </w:r>
+            <w:proofErr w:type="gramStart"/>
+            <w:r>
+              <w:rPr>
+                <w:rFonts w:ascii="Aptos" w:hAnsi="Aptos" w:cs="Times New Roman"/>
+                <w:color w:val="494C4E"/>
+                <w:kern w:val="0"/>
+                <w:sz w:val="18"/>
+                <w:szCs w:val="18"/>
+                <w14:ligatures w14:val="none"/>
+              </w:rPr>
+              <w:t>colors: #731D2C, #</w:t>
+            </w:r>
+            <w:proofErr w:type="gramEnd"/>
+            <w:r>
+              <w:rPr>
+                <w:rFonts w:ascii="Aptos" w:hAnsi="Aptos" w:cs="Times New Roman"/>
+                <w:color w:val="494C4E"/>
+                <w:kern w:val="0"/>
+                <w:sz w:val="18"/>
+                <w:szCs w:val="18"/>
+                <w14:ligatures w14:val="none"/>
+              </w:rPr>
+              <w:t>59573</w:t>
+            </w:r>
+            <w:proofErr w:type="gramStart"/>
+            <w:r>
+              <w:rPr>
+                <w:rFonts w:ascii="Aptos" w:hAnsi="Aptos" w:cs="Times New Roman"/>
+                <w:color w:val="494C4E"/>
+                <w:kern w:val="0"/>
+                <w:sz w:val="18"/>
+                <w:szCs w:val="18"/>
+                <w14:ligatures w14:val="none"/>
+              </w:rPr>
+              <w:t>C, #D99748, #401801, #</w:t>
+            </w:r>
+            <w:proofErr w:type="gramEnd"/>
+            <w:r>
+              <w:rPr>
+                <w:rFonts w:ascii="Aptos" w:hAnsi="Aptos" w:cs="Times New Roman"/>
+                <w:color w:val="494C4E"/>
+                <w:kern w:val="0"/>
+                <w:sz w:val="18"/>
+                <w:szCs w:val="18"/>
+                <w14:ligatures w14:val="none"/>
+              </w:rPr>
+              <w:t>8C471F</w:t>
             </w:r>
           </w:p>
         </w:tc>
       </w:tr>
     </w:tbl>
     <w:p/>
+    <w:p/>
     <w:p>
-      <w:r>
-        <w:lastRenderedPageBreak/>
+      <w:pPr>
+        <w:pStyle w:val="Heading2"/>
+      </w:pPr>
+      <w:r>
+        <w:t xml:space="preserve">Links </w:t>
+      </w:r>
+    </w:p>
+    <w:p>
+      <w:r>
         <w:t>GITHUB REPO:</w:t>
       </w:r>
       <w:r>
         <w:t xml:space="preserve"> </w:t>
       </w:r>
-      <w:hyperlink r:id="rId4" w:history="1">
+      <w:hyperlink r:id="rId5" w:history="1">
         <w:r>
           <w:rPr>
             <w:rStyle w:val="Hyperlink"/>
@@ -1360,7 +1562,7 @@
       <w:r>
         <w:t xml:space="preserve"> </w:t>
       </w:r>
-      <w:hyperlink r:id="rId5" w:history="1">
+      <w:hyperlink r:id="rId6" w:history="1">
         <w:r>
           <w:rPr>
             <w:rStyle w:val="Hyperlink"/>
@@ -1375,7 +1577,15 @@
         <w:t xml:space="preserve">Added img of original </w:t>
       </w:r>
       <w:r>
-        <w:t>file format in case I have to remove it to get the GitHub Pages to work.</w:t>
+        <w:t xml:space="preserve">file format in case I </w:t>
+      </w:r>
+      <w:proofErr w:type="gramStart"/>
+      <w:r>
+        <w:t>have to</w:t>
+      </w:r>
+      <w:proofErr w:type="gramEnd"/>
+      <w:r>
+        <w:t xml:space="preserve"> remove it to get the GitHub Pages to work.</w:t>
       </w:r>
     </w:p>
     <w:p>
@@ -1384,9 +1594,9 @@
           <w:noProof/>
         </w:rPr>
         <w:drawing>
-          <wp:inline distT="0" distB="0" distL="0" distR="0" wp14:anchorId="239EB31B" wp14:editId="4EB86023">
-            <wp:extent cx="5494294" cy="4468633"/>
-            <wp:effectExtent l="0" t="0" r="0" b="8255"/>
+          <wp:inline distT="0" distB="0" distL="0" distR="0" wp14:anchorId="239EB31B" wp14:editId="57EC431A">
+            <wp:extent cx="5064981" cy="4119463"/>
+            <wp:effectExtent l="0" t="0" r="2540" b="0"/>
             <wp:docPr id="1527601740" name="Picture 1"/>
             <wp:cNvGraphicFramePr>
               <a:graphicFrameLocks xmlns:a="http://schemas.openxmlformats.org/drawingml/2006/main" noChangeAspect="1"/>
@@ -1399,7 +1609,7 @@
                     <pic:cNvPicPr/>
                   </pic:nvPicPr>
                   <pic:blipFill rotWithShape="1">
-                    <a:blip r:embed="rId6"/>
+                    <a:blip r:embed="rId7"/>
                     <a:srcRect r="33913"/>
                     <a:stretch>
                       <a:fillRect/>
@@ -1408,7 +1618,7 @@
                   <pic:spPr bwMode="auto">
                     <a:xfrm>
                       <a:off x="0" y="0"/>
-                      <a:ext cx="5507118" cy="4479063"/>
+                      <a:ext cx="5080340" cy="4131955"/>
                     </a:xfrm>
                     <a:prstGeom prst="rect">
                       <a:avLst/>
@@ -1867,7 +2077,6 @@
     <w:next w:val="Normal"/>
     <w:link w:val="Heading2Char"/>
     <w:uiPriority w:val="9"/>
-    <w:semiHidden/>
     <w:unhideWhenUsed/>
     <w:qFormat/>
     <w:rsid w:val="00E7780A"/>
@@ -1890,7 +2099,6 @@
     <w:next w:val="Normal"/>
     <w:link w:val="Heading3Char"/>
     <w:uiPriority w:val="9"/>
-    <w:semiHidden/>
     <w:unhideWhenUsed/>
     <w:qFormat/>
     <w:rsid w:val="00E7780A"/>
@@ -2042,7 +2250,6 @@
   <w:style w:type="character" w:default="1" w:styleId="DefaultParagraphFont">
     <w:name w:val="Default Paragraph Font"/>
     <w:uiPriority w:val="1"/>
-    <w:semiHidden/>
     <w:unhideWhenUsed/>
   </w:style>
   <w:style w:type="table" w:default="1" w:styleId="TableNormal">
@@ -2084,7 +2291,6 @@
     <w:basedOn w:val="DefaultParagraphFont"/>
     <w:link w:val="Heading2"/>
     <w:uiPriority w:val="9"/>
-    <w:semiHidden/>
     <w:rsid w:val="00E7780A"/>
     <w:rPr>
       <w:rFonts w:asciiTheme="majorHAnsi" w:eastAsiaTheme="majorEastAsia" w:hAnsiTheme="majorHAnsi" w:cstheme="majorBidi"/>
@@ -2098,7 +2304,6 @@
     <w:basedOn w:val="DefaultParagraphFont"/>
     <w:link w:val="Heading3"/>
     <w:uiPriority w:val="9"/>
-    <w:semiHidden/>
     <w:rsid w:val="00E7780A"/>
     <w:rPr>
       <w:rFonts w:eastAsiaTheme="majorEastAsia" w:cstheme="majorBidi"/>

</xml_diff>